<commit_message>
Remove publishing section from Getting Started Guide
Not relevant for end users of the skill.

Co-Authored-By: Claude Opus 4.6 <noreply@anthropic.com>
</commit_message>
<xml_diff>
--- a/Getting-Started-Guide.docx
+++ b/Getting-Started-Guide.docx
@@ -3142,112 +3142,6 @@
         <w:br w:type="page"/>
       </w:r>
     </w:p>
-    <w:p>
-      <w:pPr>
-        <w:pStyle w:val="Heading1"/>
-      </w:pPr>
-      <w:r>
-        <w:t xml:space="preserve">Where to Publish and Share the Skill</w:t>
-      </w:r>
-    </w:p>
-    <w:p>
-      <w:r>
-        <w:t xml:space="preserve">If you’ve built this skill and want others to use it, there are several ways to share it:</w:t>
-      </w:r>
-    </w:p>
-    <w:p>
-      <w:pPr>
-        <w:spacing w:after="120"/>
-      </w:pPr>
-      <w:r>
-        <w:t xml:space="preserve"/>
-      </w:r>
-    </w:p>
-    <w:p>
-      <w:pPr>
-        <w:pStyle w:val="Heading2"/>
-      </w:pPr>
-      <w:r>
-        <w:t xml:space="preserve">Direct Sharing (Simplest)</w:t>
-      </w:r>
-    </w:p>
-    <w:p>
-      <w:r>
-        <w:t xml:space="preserve">Just send someone the </w:t>
-      </w:r>
-      <w:r>
-        <w:rPr>
-          <w:b/>
-          <w:bCs/>
-        </w:rPr>
-        <w:t xml:space="preserve">financial-planner.skill</w:t>
-      </w:r>
-      <w:r>
-        <w:t xml:space="preserve"> file directly — via email, Google Drive, Dropbox, or any file-sharing method. They follow the installation steps in this guide and they’re up and running. This is the easiest option for sharing with friends, family, or a small group.</w:t>
-      </w:r>
-    </w:p>
-    <w:p>
-      <w:pPr>
-        <w:spacing w:after="120"/>
-      </w:pPr>
-      <w:r>
-        <w:t xml:space="preserve"/>
-      </w:r>
-    </w:p>
-    <w:p>
-      <w:pPr>
-        <w:pStyle w:val="Heading2"/>
-      </w:pPr>
-      <w:r>
-        <w:t xml:space="preserve">Official Anthropic Marketplace</w:t>
-      </w:r>
-    </w:p>
-    <w:p>
-      <w:r>
-        <w:t xml:space="preserve">Anthropic has a plugin submission portal at </w:t>
-      </w:r>
-      <w:hyperlink w:history="1" r:id="rIdajzrno593gzykobuoqw-7">
-        <w:r>
-          <w:rPr>
-            <w:rStyle w:val="Hyperlink"/>
-            <w:color w:val="2563EB"/>
-          </w:rPr>
-          <w:t xml:space="preserve">platform.claude.com</w:t>
-        </w:r>
-      </w:hyperlink>
-      <w:r>
-        <w:t xml:space="preserve">. This is the official channel for publishing skills and plugins that can be discovered by all Claude users. Submission involves a review process by Anthropic’s team.</w:t>
-      </w:r>
-    </w:p>
-    <w:p>
-      <w:pPr>
-        <w:spacing w:after="120"/>
-      </w:pPr>
-      <w:r>
-        <w:t xml:space="preserve"/>
-      </w:r>
-    </w:p>
-    <w:p>
-      <w:pPr>
-        <w:pStyle w:val="Heading2"/>
-      </w:pPr>
-      <w:r>
-        <w:t xml:space="preserve">Community Marketplaces (GitHub)</w:t>
-      </w:r>
-    </w:p>
-    <w:p>
-      <w:r>
-        <w:t xml:space="preserve">Several community-maintained GitHub repositories serve as skill and plugin directories. You can publish your skill to one of these open-source collections. This gives you visibility among the Claude developer community and makes the skill discoverable through search.</w:t>
-      </w:r>
-    </w:p>
-    <w:p>
-      <w:pPr>
-        <w:spacing w:after="120"/>
-      </w:pPr>
-      <w:r>
-        <w:t xml:space="preserve"/>
-      </w:r>
-    </w:p>
     <w:tbl>
       <w:tblPr>
         <w:tblW w:type="dxa" w:w="9360"/>
@@ -3304,11 +3198,6 @@
         </w:tc>
       </w:tr>
     </w:tbl>
-    <w:p>
-      <w:r>
-        <w:br w:type="page"/>
-      </w:r>
-    </w:p>
     <w:p>
       <w:pPr>
         <w:pStyle w:val="Heading1"/>

</xml_diff>

<commit_message>
Add GitHub clone install option to Getting Started Guide and README
Users can now install the skill directly from the GitHub repo
instead of needing the .skill file.

Co-Authored-By: Claude Opus 4.6 <noreply@anthropic.com>
</commit_message>
<xml_diff>
--- a/Getting-Started-Guide.docx
+++ b/Getting-Started-Guide.docx
@@ -3806,35 +3806,16 @@
         </w:tc>
       </w:tr>
     </w:tbl>
-    <w:p>
-      <w:pPr>
-        <w:spacing w:after="120"/>
-      </w:pPr>
-      <w:r>
-        <w:t xml:space="preserve"/>
-      </w:r>
-    </w:p>
-    <w:p>
-      <w:pPr>
-        <w:pStyle w:val="Heading3"/>
-      </w:pPr>
-      <w:r>
-        <w:t xml:space="preserve">Step 5: Start using the skill</w:t>
-      </w:r>
-    </w:p>
-    <w:p>
-      <w:r>
-        <w:t xml:space="preserve">Navigate to a folder where you want your financial plan files saved, then launch Claude:</w:t>
-      </w:r>
-    </w:p>
-    <w:p>
-      <w:pPr>
-        <w:spacing w:after="120"/>
-      </w:pPr>
-      <w:r>
-        <w:t xml:space="preserve"/>
-      </w:r>
-    </w:p>
+    <w:p/>
+    <w:p>
+      <w:r>
+        <w:rPr>
+          <w:b/>
+        </w:rPr>
+        <w:t xml:space="preserve">Or install directly from GitHub:</w:t>
+      </w:r>
+    </w:p>
+    <w:p/>
     <w:tbl>
       <w:tblPr>
         <w:tblW w:type="dxa" w:w="9360"/>
@@ -3876,7 +3857,11 @@
                 <w:sz w:val="20"/>
                 <w:szCs w:val="20"/>
               </w:rPr>
-              <w:t xml:space="preserve"># Create a folder for your financial plan</w:t>
+              <w:t xml:space="preserve"># Install from GitHub
+mkdir -p ~/.claude/skills
+git clone https://github.com/cjpatten/canadian-finance-planner-skill.git
+cp -r canadian-finance-planner-skill/financial-planner ~/.claude/skills/
+rm -rf canadian-finance-planner-skill</w:t>
             </w:r>
           </w:p>
           <w:p>
@@ -3887,7 +3872,11 @@
                 <w:sz w:val="22"/>
                 <w:szCs w:val="22"/>
               </w:rPr>
-              <w:t xml:space="preserve">mkdir -p ~/Documents/MyFinances</w:t>
+              <w:t xml:space="preserve"># Install from GitHub
+mkdir -p ~/.claude/skills
+git clone https://github.com/cjpatten/canadian-finance-planner-skill.git
+cp -r canadian-finance-planner-skill/financial-planner ~/.claude/skills/
+rm -rf canadian-finance-planner-skill</w:t>
             </w:r>
           </w:p>
           <w:p>
@@ -3898,18 +3887,11 @@
                 <w:sz w:val="22"/>
                 <w:szCs w:val="22"/>
               </w:rPr>
-              <w:t xml:space="preserve">cd ~/Documents/MyFinances</w:t>
-            </w:r>
-          </w:p>
-          <w:p>
-            <w:r>
-              <w:rPr>
-                <w:rFonts w:ascii="Courier New" w:cs="Courier New" w:eastAsia="Courier New" w:hAnsi="Courier New"/>
-                <w:color w:val="E5E7EB"/>
-                <w:sz w:val="22"/>
-                <w:szCs w:val="22"/>
-              </w:rPr>
-              <w:t xml:space="preserve"/>
+              <w:t xml:space="preserve"># Install from GitHub
+mkdir -p ~/.claude/skills
+git clone https://github.com/cjpatten/canadian-finance-planner-skill.git
+cp -r canadian-finance-planner-skill/financial-planner ~/.claude/skills/
+rm -rf canadian-finance-planner-skill</w:t>
             </w:r>
           </w:p>
           <w:p>
@@ -3920,7 +3902,11 @@
                 <w:sz w:val="20"/>
                 <w:szCs w:val="20"/>
               </w:rPr>
-              <w:t xml:space="preserve"># Launch Claude Code</w:t>
+              <w:t xml:space="preserve"># Install from GitHub
+mkdir -p ~/.claude/skills
+git clone https://github.com/cjpatten/canadian-finance-planner-skill.git
+cp -r canadian-finance-planner-skill/financial-planner ~/.claude/skills/
+rm -rf canadian-finance-planner-skill</w:t>
             </w:r>
           </w:p>
           <w:p>
@@ -3931,49 +3917,17 @@
                 <w:sz w:val="22"/>
                 <w:szCs w:val="22"/>
               </w:rPr>
-              <w:t xml:space="preserve">claude</w:t>
+              <w:t xml:space="preserve"># Install from GitHub
+mkdir -p ~/.claude/skills
+git clone https://github.com/cjpatten/canadian-finance-planner-skill.git
+cp -r canadian-finance-planner-skill/financial-planner ~/.claude/skills/
+rm -rf canadian-finance-planner-skill</w:t>
             </w:r>
           </w:p>
         </w:tc>
       </w:tr>
     </w:tbl>
-    <w:p>
-      <w:pPr>
-        <w:spacing w:after="120"/>
-      </w:pPr>
-      <w:r>
-        <w:t xml:space="preserve"/>
-      </w:r>
-    </w:p>
-    <w:p>
-      <w:r>
-        <w:t xml:space="preserve">Once Claude starts, just type: </w:t>
-      </w:r>
-      <w:r>
-        <w:rPr>
-          <w:i/>
-          <w:iCs/>
-          <w:color w:val="6B7280"/>
-        </w:rPr>
-        <w:t xml:space="preserve">“Help me build a Canadian financial plan”</w:t>
-      </w:r>
-      <w:r>
-        <w:t xml:space="preserve"> and the skill will activate.</w:t>
-      </w:r>
-    </w:p>
-    <w:p>
-      <w:r>
-        <w:br w:type="page"/>
-      </w:r>
-    </w:p>
-    <w:p>
-      <w:pPr>
-        <w:pStyle w:val="Heading2"/>
-      </w:pPr>
-      <w:r>
-        <w:t xml:space="preserve">Windows Instructions</w:t>
-      </w:r>
-    </w:p>
+    <w:p/>
     <w:p>
       <w:pPr>
         <w:spacing w:after="120"/>
@@ -3987,12 +3941,12 @@
         <w:pStyle w:val="Heading3"/>
       </w:pPr>
       <w:r>
-        <w:t xml:space="preserve">Step 1: Install WSL (Windows Subsystem for Linux)</w:t>
-      </w:r>
-    </w:p>
-    <w:p>
-      <w:r>
-        <w:t xml:space="preserve">Claude Code runs inside WSL, which gives you a Linux terminal on Windows. Open PowerShell as Administrator (right-click the Start button &gt; “Windows Terminal (Admin)” or “PowerShell (Admin)”) and run:</w:t>
+        <w:t xml:space="preserve">Step 5: Start using the skill</w:t>
+      </w:r>
+    </w:p>
+    <w:p>
+      <w:r>
+        <w:t xml:space="preserve">Navigate to a folder where you want your financial plan files saved, then launch Claude:</w:t>
       </w:r>
     </w:p>
     <w:p>
@@ -4040,11 +3994,66 @@
             <w:r>
               <w:rPr>
                 <w:rFonts w:ascii="Courier New" w:cs="Courier New" w:eastAsia="Courier New" w:hAnsi="Courier New"/>
+                <w:color w:val="6B7280"/>
+                <w:sz w:val="20"/>
+                <w:szCs w:val="20"/>
+              </w:rPr>
+              <w:t xml:space="preserve"># Create a folder for your financial plan</w:t>
+            </w:r>
+          </w:p>
+          <w:p>
+            <w:r>
+              <w:rPr>
+                <w:rFonts w:ascii="Courier New" w:cs="Courier New" w:eastAsia="Courier New" w:hAnsi="Courier New"/>
                 <w:color w:val="E5E7EB"/>
                 <w:sz w:val="22"/>
                 <w:szCs w:val="22"/>
               </w:rPr>
-              <w:t xml:space="preserve">wsl --install</w:t>
+              <w:t xml:space="preserve">mkdir -p ~/Documents/MyFinances</w:t>
+            </w:r>
+          </w:p>
+          <w:p>
+            <w:r>
+              <w:rPr>
+                <w:rFonts w:ascii="Courier New" w:cs="Courier New" w:eastAsia="Courier New" w:hAnsi="Courier New"/>
+                <w:color w:val="E5E7EB"/>
+                <w:sz w:val="22"/>
+                <w:szCs w:val="22"/>
+              </w:rPr>
+              <w:t xml:space="preserve">cd ~/Documents/MyFinances</w:t>
+            </w:r>
+          </w:p>
+          <w:p>
+            <w:r>
+              <w:rPr>
+                <w:rFonts w:ascii="Courier New" w:cs="Courier New" w:eastAsia="Courier New" w:hAnsi="Courier New"/>
+                <w:color w:val="E5E7EB"/>
+                <w:sz w:val="22"/>
+                <w:szCs w:val="22"/>
+              </w:rPr>
+              <w:t xml:space="preserve"/>
+            </w:r>
+          </w:p>
+          <w:p>
+            <w:r>
+              <w:rPr>
+                <w:rFonts w:ascii="Courier New" w:cs="Courier New" w:eastAsia="Courier New" w:hAnsi="Courier New"/>
+                <w:color w:val="6B7280"/>
+                <w:sz w:val="20"/>
+                <w:szCs w:val="20"/>
+              </w:rPr>
+              <w:t xml:space="preserve"># Launch Claude Code</w:t>
+            </w:r>
+          </w:p>
+          <w:p>
+            <w:r>
+              <w:rPr>
+                <w:rFonts w:ascii="Courier New" w:cs="Courier New" w:eastAsia="Courier New" w:hAnsi="Courier New"/>
+                <w:color w:val="E5E7EB"/>
+                <w:sz w:val="22"/>
+                <w:szCs w:val="22"/>
+              </w:rPr>
+              <w:t xml:space="preserve">claude</w:t>
             </w:r>
           </w:p>
         </w:tc>
@@ -4060,7 +4069,52 @@
     </w:p>
     <w:p>
       <w:r>
-        <w:t xml:space="preserve">This installs Ubuntu (a Linux distribution) inside Windows. You’ll need to restart your computer when prompted. After restarting, WSL will open automatically and ask you to create a username and password — these are just for WSL and can be anything you’ll remember.</w:t>
+        <w:t xml:space="preserve">Once Claude starts, just type: </w:t>
+      </w:r>
+      <w:r>
+        <w:rPr>
+          <w:i/>
+          <w:iCs/>
+          <w:color w:val="6B7280"/>
+        </w:rPr>
+        <w:t xml:space="preserve">“Help me build a Canadian financial plan”</w:t>
+      </w:r>
+      <w:r>
+        <w:t xml:space="preserve"> and the skill will activate.</w:t>
+      </w:r>
+    </w:p>
+    <w:p>
+      <w:r>
+        <w:br w:type="page"/>
+      </w:r>
+    </w:p>
+    <w:p>
+      <w:pPr>
+        <w:pStyle w:val="Heading2"/>
+      </w:pPr>
+      <w:r>
+        <w:t xml:space="preserve">Windows Instructions</w:t>
+      </w:r>
+    </w:p>
+    <w:p>
+      <w:pPr>
+        <w:spacing w:after="120"/>
+      </w:pPr>
+      <w:r>
+        <w:t xml:space="preserve"/>
+      </w:r>
+    </w:p>
+    <w:p>
+      <w:pPr>
+        <w:pStyle w:val="Heading3"/>
+      </w:pPr>
+      <w:r>
+        <w:t xml:space="preserve">Step 1: Install WSL (Windows Subsystem for Linux)</w:t>
+      </w:r>
+    </w:p>
+    <w:p>
+      <w:r>
+        <w:t xml:space="preserve">Claude Code runs inside WSL, which gives you a Linux terminal on Windows. Open PowerShell as Administrator (right-click the Start button &gt; “Windows Terminal (Admin)” or “PowerShell (Admin)”) and run:</w:t>
       </w:r>
     </w:p>
     <w:p>
@@ -4091,12 +4145,12 @@
           <w:tcPr>
             <w:tcW w:type="dxa" w:w="9360"/>
             <w:tcBorders>
-              <w:top w:val="single" w:color="93C5FD" w:sz="1"/>
-              <w:left w:val="single" w:color="2563EB" w:sz="6"/>
-              <w:bottom w:val="single" w:color="93C5FD" w:sz="1"/>
-              <w:right w:val="single" w:color="93C5FD" w:sz="1"/>
-            </w:tcBorders>
-            <w:shd w:fill="EFF6FF" w:val="clear"/>
+              <w:top w:val="single" w:color="D1D5DB" w:sz="1"/>
+              <w:left w:val="single" w:color="D1D5DB" w:sz="1"/>
+              <w:bottom w:val="single" w:color="D1D5DB" w:sz="1"/>
+              <w:right w:val="single" w:color="D1D5DB" w:sz="1"/>
+            </w:tcBorders>
+            <w:shd w:fill="1F2937" w:val="clear"/>
             <w:tcMar>
               <w:top w:type="dxa" w:w="120"/>
               <w:left w:type="dxa" w:w="200"/>
@@ -4105,23 +4159,14 @@
             </w:tcMar>
           </w:tcPr>
           <w:p>
-            <w:pPr>
-              <w:spacing w:after="60"/>
-            </w:pPr>
-            <w:r>
-              <w:rPr>
-                <w:b/>
-                <w:bCs/>
-                <w:color w:val="2563EB"/>
-                <w:sz w:val="22"/>
-                <w:szCs w:val="22"/>
-              </w:rPr>
-              <w:t xml:space="preserve">Already have WSL?</w:t>
-            </w:r>
-          </w:p>
-          <w:p>
-            <w:r>
-              <w:t xml:space="preserve">If you’ve installed WSL before, you can skip this step. Just open your WSL terminal (search for “Ubuntu” or “WSL” in the Start menu).</w:t>
+            <w:r>
+              <w:rPr>
+                <w:rFonts w:ascii="Courier New" w:cs="Courier New" w:eastAsia="Courier New" w:hAnsi="Courier New"/>
+                <w:color w:val="E5E7EB"/>
+                <w:sz w:val="22"/>
+                <w:szCs w:val="22"/>
+              </w:rPr>
+              <w:t xml:space="preserve">wsl --install</w:t>
             </w:r>
           </w:p>
         </w:tc>
@@ -4136,16 +4181,8 @@
       </w:r>
     </w:p>
     <w:p>
-      <w:pPr>
-        <w:pStyle w:val="Heading3"/>
-      </w:pPr>
-      <w:r>
-        <w:t xml:space="preserve">Step 2: Install Node.js inside WSL</w:t>
-      </w:r>
-    </w:p>
-    <w:p>
-      <w:r>
-        <w:t xml:space="preserve">Open your WSL/Ubuntu terminal and run these commands one at a time:</w:t>
+      <w:r>
+        <w:t xml:space="preserve">This installs Ubuntu (a Linux distribution) inside Windows. You’ll need to restart your computer when prompted. After restarting, WSL will open automatically and ask you to create a username and password — these are just for WSL and can be anything you’ll remember.</w:t>
       </w:r>
     </w:p>
     <w:p>
@@ -4176,12 +4213,12 @@
           <w:tcPr>
             <w:tcW w:type="dxa" w:w="9360"/>
             <w:tcBorders>
-              <w:top w:val="single" w:color="D1D5DB" w:sz="1"/>
-              <w:left w:val="single" w:color="D1D5DB" w:sz="1"/>
-              <w:bottom w:val="single" w:color="D1D5DB" w:sz="1"/>
-              <w:right w:val="single" w:color="D1D5DB" w:sz="1"/>
-            </w:tcBorders>
-            <w:shd w:fill="1F2937" w:val="clear"/>
+              <w:top w:val="single" w:color="93C5FD" w:sz="1"/>
+              <w:left w:val="single" w:color="2563EB" w:sz="6"/>
+              <w:bottom w:val="single" w:color="93C5FD" w:sz="1"/>
+              <w:right w:val="single" w:color="93C5FD" w:sz="1"/>
+            </w:tcBorders>
+            <w:shd w:fill="EFF6FF" w:val="clear"/>
             <w:tcMar>
               <w:top w:type="dxa" w:w="120"/>
               <w:left w:type="dxa" w:w="200"/>
@@ -4190,36 +4227,23 @@
             </w:tcMar>
           </w:tcPr>
           <w:p>
-            <w:r>
-              <w:rPr>
-                <w:rFonts w:ascii="Courier New" w:cs="Courier New" w:eastAsia="Courier New" w:hAnsi="Courier New"/>
-                <w:color w:val="6B7280"/>
-                <w:sz w:val="20"/>
-                <w:szCs w:val="20"/>
-              </w:rPr>
-              <w:t xml:space="preserve"># Install Node.js using the NodeSource setup</w:t>
-            </w:r>
-          </w:p>
-          <w:p>
-            <w:r>
-              <w:rPr>
-                <w:rFonts w:ascii="Courier New" w:cs="Courier New" w:eastAsia="Courier New" w:hAnsi="Courier New"/>
-                <w:color w:val="E5E7EB"/>
-                <w:sz w:val="22"/>
-                <w:szCs w:val="22"/>
-              </w:rPr>
-              <w:t xml:space="preserve">curl -fsSL https://deb.nodesource.com/setup_20.x | sudo -E bash -</w:t>
-            </w:r>
-          </w:p>
-          <w:p>
-            <w:r>
-              <w:rPr>
-                <w:rFonts w:ascii="Courier New" w:cs="Courier New" w:eastAsia="Courier New" w:hAnsi="Courier New"/>
-                <w:color w:val="E5E7EB"/>
-                <w:sz w:val="22"/>
-                <w:szCs w:val="22"/>
-              </w:rPr>
-              <w:t xml:space="preserve">sudo apt-get install -y nodejs</w:t>
+            <w:pPr>
+              <w:spacing w:after="60"/>
+            </w:pPr>
+            <w:r>
+              <w:rPr>
+                <w:b/>
+                <w:bCs/>
+                <w:color w:val="2563EB"/>
+                <w:sz w:val="22"/>
+                <w:szCs w:val="22"/>
+              </w:rPr>
+              <w:t xml:space="preserve">Already have WSL?</w:t>
+            </w:r>
+          </w:p>
+          <w:p>
+            <w:r>
+              <w:t xml:space="preserve">If you’ve installed WSL before, you can skip this step. Just open your WSL terminal (search for “Ubuntu” or “WSL” in the Start menu).</w:t>
             </w:r>
           </w:p>
         </w:tc>
@@ -4234,36 +4258,16 @@
       </w:r>
     </w:p>
     <w:p>
-      <w:r>
-        <w:t xml:space="preserve">It will ask for your WSL password (the one you created in Step 1). Verify it worked with: </w:t>
-      </w:r>
-      <w:r>
-        <w:rPr>
-          <w:b/>
-          <w:bCs/>
-        </w:rPr>
-        <w:t xml:space="preserve">node --version</w:t>
-      </w:r>
-    </w:p>
-    <w:p>
-      <w:pPr>
-        <w:spacing w:after="120"/>
-      </w:pPr>
-      <w:r>
-        <w:t xml:space="preserve"/>
-      </w:r>
-    </w:p>
-    <w:p>
       <w:pPr>
         <w:pStyle w:val="Heading3"/>
       </w:pPr>
       <w:r>
-        <w:t xml:space="preserve">Step 3: Install Claude Code</w:t>
-      </w:r>
-    </w:p>
-    <w:p>
-      <w:r>
-        <w:t xml:space="preserve">Still in the WSL terminal, run:</w:t>
+        <w:t xml:space="preserve">Step 2: Install Node.js inside WSL</w:t>
+      </w:r>
+    </w:p>
+    <w:p>
+      <w:r>
+        <w:t xml:space="preserve">Open your WSL/Ubuntu terminal and run these commands one at a time:</w:t>
       </w:r>
     </w:p>
     <w:p>
@@ -4311,11 +4315,33 @@
             <w:r>
               <w:rPr>
                 <w:rFonts w:ascii="Courier New" w:cs="Courier New" w:eastAsia="Courier New" w:hAnsi="Courier New"/>
+                <w:color w:val="6B7280"/>
+                <w:sz w:val="20"/>
+                <w:szCs w:val="20"/>
+              </w:rPr>
+              <w:t xml:space="preserve"># Install Node.js using the NodeSource setup</w:t>
+            </w:r>
+          </w:p>
+          <w:p>
+            <w:r>
+              <w:rPr>
+                <w:rFonts w:ascii="Courier New" w:cs="Courier New" w:eastAsia="Courier New" w:hAnsi="Courier New"/>
                 <w:color w:val="E5E7EB"/>
                 <w:sz w:val="22"/>
                 <w:szCs w:val="22"/>
               </w:rPr>
-              <w:t xml:space="preserve">npm install -g @anthropic-ai/claude-code</w:t>
+              <w:t xml:space="preserve">curl -fsSL https://deb.nodesource.com/setup_20.x | sudo -E bash -</w:t>
+            </w:r>
+          </w:p>
+          <w:p>
+            <w:r>
+              <w:rPr>
+                <w:rFonts w:ascii="Courier New" w:cs="Courier New" w:eastAsia="Courier New" w:hAnsi="Courier New"/>
+                <w:color w:val="E5E7EB"/>
+                <w:sz w:val="22"/>
+                <w:szCs w:val="22"/>
+              </w:rPr>
+              <w:t xml:space="preserve">sudo apt-get install -y nodejs</w:t>
             </w:r>
           </w:p>
         </w:tc>
@@ -4331,7 +4357,35 @@
     </w:p>
     <w:p>
       <w:r>
-        <w:t xml:space="preserve">Wait for it to finish, then sign in:</w:t>
+        <w:t xml:space="preserve">It will ask for your WSL password (the one you created in Step 1). Verify it worked with: </w:t>
+      </w:r>
+      <w:r>
+        <w:rPr>
+          <w:b/>
+          <w:bCs/>
+        </w:rPr>
+        <w:t xml:space="preserve">node --version</w:t>
+      </w:r>
+    </w:p>
+    <w:p>
+      <w:pPr>
+        <w:spacing w:after="120"/>
+      </w:pPr>
+      <w:r>
+        <w:t xml:space="preserve"/>
+      </w:r>
+    </w:p>
+    <w:p>
+      <w:pPr>
+        <w:pStyle w:val="Heading3"/>
+      </w:pPr>
+      <w:r>
+        <w:t xml:space="preserve">Step 3: Install Claude Code</w:t>
+      </w:r>
+    </w:p>
+    <w:p>
+      <w:r>
+        <w:t xml:space="preserve">Still in the WSL terminal, run:</w:t>
       </w:r>
     </w:p>
     <w:p>
@@ -4383,7 +4437,7 @@
                 <w:sz w:val="22"/>
                 <w:szCs w:val="22"/>
               </w:rPr>
-              <w:t xml:space="preserve">claude</w:t>
+              <w:t xml:space="preserve">npm install -g @anthropic-ai/claude-code</w:t>
             </w:r>
           </w:p>
         </w:tc>
@@ -4399,38 +4453,7 @@
     </w:p>
     <w:p>
       <w:r>
-        <w:t xml:space="preserve">A browser window will open for you to sign in with your Claude account. Once signed in, return to the terminal.</w:t>
-      </w:r>
-    </w:p>
-    <w:p>
-      <w:pPr>
-        <w:spacing w:after="120"/>
-      </w:pPr>
-      <w:r>
-        <w:t xml:space="preserve"/>
-      </w:r>
-    </w:p>
-    <w:p>
-      <w:pPr>
-        <w:pStyle w:val="Heading3"/>
-      </w:pPr>
-      <w:r>
-        <w:t xml:space="preserve">Step 4: Install the Financial Planner skill</w:t>
-      </w:r>
-    </w:p>
-    <w:p>
-      <w:r>
-        <w:t xml:space="preserve">First, copy the .skill file from your Windows Downloads folder to WSL. In WSL, your Windows C: drive is accessible at </w:t>
-      </w:r>
-      <w:r>
-        <w:rPr>
-          <w:b/>
-          <w:bCs/>
-        </w:rPr>
-        <w:t xml:space="preserve">/mnt/c/</w:t>
-      </w:r>
-      <w:r>
-        <w:t xml:space="preserve">. Run these commands:</w:t>
+        <w:t xml:space="preserve">Wait for it to finish, then sign in:</w:t>
       </w:r>
     </w:p>
     <w:p>
@@ -4478,60 +4501,60 @@
             <w:r>
               <w:rPr>
                 <w:rFonts w:ascii="Courier New" w:cs="Courier New" w:eastAsia="Courier New" w:hAnsi="Courier New"/>
-                <w:color w:val="6B7280"/>
-                <w:sz w:val="20"/>
-                <w:szCs w:val="20"/>
-              </w:rPr>
-              <w:t xml:space="preserve"># Create the skills folder</w:t>
-            </w:r>
-          </w:p>
-          <w:p>
-            <w:r>
-              <w:rPr>
-                <w:rFonts w:ascii="Courier New" w:cs="Courier New" w:eastAsia="Courier New" w:hAnsi="Courier New"/>
                 <w:color w:val="E5E7EB"/>
                 <w:sz w:val="22"/>
                 <w:szCs w:val="22"/>
               </w:rPr>
-              <w:t xml:space="preserve">mkdir -p ~/.claude/skills</w:t>
-            </w:r>
-          </w:p>
-          <w:p>
-            <w:r>
-              <w:rPr>
-                <w:rFonts w:ascii="Courier New" w:cs="Courier New" w:eastAsia="Courier New" w:hAnsi="Courier New"/>
-                <w:color w:val="E5E7EB"/>
-                <w:sz w:val="22"/>
-                <w:szCs w:val="22"/>
-              </w:rPr>
-              <w:t xml:space="preserve"/>
-            </w:r>
-          </w:p>
-          <w:p>
-            <w:r>
-              <w:rPr>
-                <w:rFonts w:ascii="Courier New" w:cs="Courier New" w:eastAsia="Courier New" w:hAnsi="Courier New"/>
-                <w:color w:val="6B7280"/>
-                <w:sz w:val="20"/>
-                <w:szCs w:val="20"/>
-              </w:rPr>
-              <w:t xml:space="preserve"># Unzip the skill file (adjust your Windows username below)</w:t>
-            </w:r>
-          </w:p>
-          <w:p>
-            <w:r>
-              <w:rPr>
-                <w:rFonts w:ascii="Courier New" w:cs="Courier New" w:eastAsia="Courier New" w:hAnsi="Courier New"/>
-                <w:color w:val="E5E7EB"/>
-                <w:sz w:val="22"/>
-                <w:szCs w:val="22"/>
-              </w:rPr>
-              <w:t xml:space="preserve">unzip /mnt/c/Users/YOUR_USERNAME/Downloads/financial-planner.skill -d ~/.claude/skills/</w:t>
+              <w:t xml:space="preserve">claude</w:t>
             </w:r>
           </w:p>
         </w:tc>
       </w:tr>
     </w:tbl>
+    <w:p>
+      <w:pPr>
+        <w:spacing w:after="120"/>
+      </w:pPr>
+      <w:r>
+        <w:t xml:space="preserve"/>
+      </w:r>
+    </w:p>
+    <w:p>
+      <w:r>
+        <w:t xml:space="preserve">A browser window will open for you to sign in with your Claude account. Once signed in, return to the terminal.</w:t>
+      </w:r>
+    </w:p>
+    <w:p>
+      <w:pPr>
+        <w:spacing w:after="120"/>
+      </w:pPr>
+      <w:r>
+        <w:t xml:space="preserve"/>
+      </w:r>
+    </w:p>
+    <w:p>
+      <w:pPr>
+        <w:pStyle w:val="Heading3"/>
+      </w:pPr>
+      <w:r>
+        <w:t xml:space="preserve">Step 4: Install the Financial Planner skill</w:t>
+      </w:r>
+    </w:p>
+    <w:p>
+      <w:r>
+        <w:t xml:space="preserve">First, copy the .skill file from your Windows Downloads folder to WSL. In WSL, your Windows C: drive is accessible at </w:t>
+      </w:r>
+      <w:r>
+        <w:rPr>
+          <w:b/>
+          <w:bCs/>
+        </w:rPr>
+        <w:t xml:space="preserve">/mnt/c/</w:t>
+      </w:r>
+      <w:r>
+        <w:t xml:space="preserve">. Run these commands:</w:t>
+      </w:r>
+    </w:p>
     <w:p>
       <w:pPr>
         <w:spacing w:after="120"/>
@@ -4560,6 +4583,105 @@
           <w:tcPr>
             <w:tcW w:type="dxa" w:w="9360"/>
             <w:tcBorders>
+              <w:top w:val="single" w:color="D1D5DB" w:sz="1"/>
+              <w:left w:val="single" w:color="D1D5DB" w:sz="1"/>
+              <w:bottom w:val="single" w:color="D1D5DB" w:sz="1"/>
+              <w:right w:val="single" w:color="D1D5DB" w:sz="1"/>
+            </w:tcBorders>
+            <w:shd w:fill="1F2937" w:val="clear"/>
+            <w:tcMar>
+              <w:top w:type="dxa" w:w="120"/>
+              <w:left w:type="dxa" w:w="200"/>
+              <w:bottom w:type="dxa" w:w="120"/>
+              <w:right w:type="dxa" w:w="200"/>
+            </w:tcMar>
+          </w:tcPr>
+          <w:p>
+            <w:r>
+              <w:rPr>
+                <w:rFonts w:ascii="Courier New" w:cs="Courier New" w:eastAsia="Courier New" w:hAnsi="Courier New"/>
+                <w:color w:val="6B7280"/>
+                <w:sz w:val="20"/>
+                <w:szCs w:val="20"/>
+              </w:rPr>
+              <w:t xml:space="preserve"># Create the skills folder</w:t>
+            </w:r>
+          </w:p>
+          <w:p>
+            <w:r>
+              <w:rPr>
+                <w:rFonts w:ascii="Courier New" w:cs="Courier New" w:eastAsia="Courier New" w:hAnsi="Courier New"/>
+                <w:color w:val="E5E7EB"/>
+                <w:sz w:val="22"/>
+                <w:szCs w:val="22"/>
+              </w:rPr>
+              <w:t xml:space="preserve">mkdir -p ~/.claude/skills</w:t>
+            </w:r>
+          </w:p>
+          <w:p>
+            <w:r>
+              <w:rPr>
+                <w:rFonts w:ascii="Courier New" w:cs="Courier New" w:eastAsia="Courier New" w:hAnsi="Courier New"/>
+                <w:color w:val="E5E7EB"/>
+                <w:sz w:val="22"/>
+                <w:szCs w:val="22"/>
+              </w:rPr>
+              <w:t xml:space="preserve"/>
+            </w:r>
+          </w:p>
+          <w:p>
+            <w:r>
+              <w:rPr>
+                <w:rFonts w:ascii="Courier New" w:cs="Courier New" w:eastAsia="Courier New" w:hAnsi="Courier New"/>
+                <w:color w:val="6B7280"/>
+                <w:sz w:val="20"/>
+                <w:szCs w:val="20"/>
+              </w:rPr>
+              <w:t xml:space="preserve"># Unzip the skill file (adjust your Windows username below)</w:t>
+            </w:r>
+          </w:p>
+          <w:p>
+            <w:r>
+              <w:rPr>
+                <w:rFonts w:ascii="Courier New" w:cs="Courier New" w:eastAsia="Courier New" w:hAnsi="Courier New"/>
+                <w:color w:val="E5E7EB"/>
+                <w:sz w:val="22"/>
+                <w:szCs w:val="22"/>
+              </w:rPr>
+              <w:t xml:space="preserve">unzip /mnt/c/Users/YOUR_USERNAME/Downloads/financial-planner.skill -d ~/.claude/skills/</w:t>
+            </w:r>
+          </w:p>
+        </w:tc>
+      </w:tr>
+    </w:tbl>
+    <w:p>
+      <w:pPr>
+        <w:spacing w:after="120"/>
+      </w:pPr>
+      <w:r>
+        <w:t xml:space="preserve"/>
+      </w:r>
+    </w:p>
+    <w:tbl>
+      <w:tblPr>
+        <w:tblW w:type="dxa" w:w="9360"/>
+        <w:tblBorders>
+          <w:top w:val="single" w:color="auto" w:sz="4"/>
+          <w:left w:val="single" w:color="auto" w:sz="4"/>
+          <w:bottom w:val="single" w:color="auto" w:sz="4"/>
+          <w:right w:val="single" w:color="auto" w:sz="4"/>
+          <w:insideH w:val="single" w:color="auto" w:sz="4"/>
+          <w:insideV w:val="single" w:color="auto" w:sz="4"/>
+        </w:tblBorders>
+      </w:tblPr>
+      <w:tblGrid>
+        <w:gridCol w:w="9360"/>
+      </w:tblGrid>
+      <w:tr>
+        <w:tc>
+          <w:tcPr>
+            <w:tcW w:type="dxa" w:w="9360"/>
+            <w:tcBorders>
               <w:top w:val="single" w:color="93C5FD" w:sz="1"/>
               <w:left w:val="single" w:color="2563EB" w:sz="6"/>
               <w:bottom w:val="single" w:color="93C5FD" w:sz="1"/>
@@ -4618,6 +4740,128 @@
         </w:tc>
       </w:tr>
     </w:tbl>
+    <w:p/>
+    <w:p>
+      <w:r>
+        <w:rPr>
+          <w:b/>
+        </w:rPr>
+        <w:t xml:space="preserve">Or install directly from GitHub:</w:t>
+      </w:r>
+    </w:p>
+    <w:p/>
+    <w:tbl>
+      <w:tblPr>
+        <w:tblW w:type="dxa" w:w="9360"/>
+        <w:tblBorders>
+          <w:top w:val="single" w:color="auto" w:sz="4"/>
+          <w:left w:val="single" w:color="auto" w:sz="4"/>
+          <w:bottom w:val="single" w:color="auto" w:sz="4"/>
+          <w:right w:val="single" w:color="auto" w:sz="4"/>
+          <w:insideH w:val="single" w:color="auto" w:sz="4"/>
+          <w:insideV w:val="single" w:color="auto" w:sz="4"/>
+        </w:tblBorders>
+      </w:tblPr>
+      <w:tblGrid>
+        <w:gridCol w:w="9360"/>
+      </w:tblGrid>
+      <w:tr>
+        <w:tc>
+          <w:tcPr>
+            <w:tcW w:type="dxa" w:w="9360"/>
+            <w:tcBorders>
+              <w:top w:val="single" w:color="D1D5DB" w:sz="1"/>
+              <w:left w:val="single" w:color="D1D5DB" w:sz="1"/>
+              <w:bottom w:val="single" w:color="D1D5DB" w:sz="1"/>
+              <w:right w:val="single" w:color="D1D5DB" w:sz="1"/>
+            </w:tcBorders>
+            <w:shd w:fill="1F2937" w:val="clear"/>
+            <w:tcMar>
+              <w:top w:type="dxa" w:w="120"/>
+              <w:left w:type="dxa" w:w="200"/>
+              <w:bottom w:type="dxa" w:w="120"/>
+              <w:right w:type="dxa" w:w="200"/>
+            </w:tcMar>
+          </w:tcPr>
+          <w:p>
+            <w:r>
+              <w:rPr>
+                <w:rFonts w:ascii="Courier New" w:cs="Courier New" w:eastAsia="Courier New" w:hAnsi="Courier New"/>
+                <w:color w:val="6B7280"/>
+                <w:sz w:val="20"/>
+                <w:szCs w:val="20"/>
+              </w:rPr>
+              <w:t xml:space="preserve"># Install from GitHub
+mkdir -p ~/.claude/skills
+git clone https://github.com/cjpatten/canadian-finance-planner-skill.git
+cp -r canadian-finance-planner-skill/financial-planner ~/.claude/skills/
+rm -rf canadian-finance-planner-skill</w:t>
+            </w:r>
+          </w:p>
+          <w:p>
+            <w:r>
+              <w:rPr>
+                <w:rFonts w:ascii="Courier New" w:cs="Courier New" w:eastAsia="Courier New" w:hAnsi="Courier New"/>
+                <w:color w:val="E5E7EB"/>
+                <w:sz w:val="22"/>
+                <w:szCs w:val="22"/>
+              </w:rPr>
+              <w:t xml:space="preserve"># Install from GitHub
+mkdir -p ~/.claude/skills
+git clone https://github.com/cjpatten/canadian-finance-planner-skill.git
+cp -r canadian-finance-planner-skill/financial-planner ~/.claude/skills/
+rm -rf canadian-finance-planner-skill</w:t>
+            </w:r>
+          </w:p>
+          <w:p>
+            <w:r>
+              <w:rPr>
+                <w:rFonts w:ascii="Courier New" w:cs="Courier New" w:eastAsia="Courier New" w:hAnsi="Courier New"/>
+                <w:color w:val="E5E7EB"/>
+                <w:sz w:val="22"/>
+                <w:szCs w:val="22"/>
+              </w:rPr>
+              <w:t xml:space="preserve"># Install from GitHub
+mkdir -p ~/.claude/skills
+git clone https://github.com/cjpatten/canadian-finance-planner-skill.git
+cp -r canadian-finance-planner-skill/financial-planner ~/.claude/skills/
+rm -rf canadian-finance-planner-skill</w:t>
+            </w:r>
+          </w:p>
+          <w:p>
+            <w:r>
+              <w:rPr>
+                <w:rFonts w:ascii="Courier New" w:cs="Courier New" w:eastAsia="Courier New" w:hAnsi="Courier New"/>
+                <w:color w:val="6B7280"/>
+                <w:sz w:val="20"/>
+                <w:szCs w:val="20"/>
+              </w:rPr>
+              <w:t xml:space="preserve"># Install from GitHub
+mkdir -p ~/.claude/skills
+git clone https://github.com/cjpatten/canadian-finance-planner-skill.git
+cp -r canadian-finance-planner-skill/financial-planner ~/.claude/skills/
+rm -rf canadian-finance-planner-skill</w:t>
+            </w:r>
+          </w:p>
+          <w:p>
+            <w:r>
+              <w:rPr>
+                <w:rFonts w:ascii="Courier New" w:cs="Courier New" w:eastAsia="Courier New" w:hAnsi="Courier New"/>
+                <w:color w:val="E5E7EB"/>
+                <w:sz w:val="22"/>
+                <w:szCs w:val="22"/>
+              </w:rPr>
+              <w:t xml:space="preserve"># Install from GitHub
+mkdir -p ~/.claude/skills
+git clone https://github.com/cjpatten/canadian-finance-planner-skill.git
+cp -r canadian-finance-planner-skill/financial-planner ~/.claude/skills/
+rm -rf canadian-finance-planner-skill</w:t>
+            </w:r>
+          </w:p>
+        </w:tc>
+      </w:tr>
+    </w:tbl>
+    <w:p/>
     <w:p>
       <w:pPr>
         <w:spacing w:after="120"/>

</xml_diff>

<commit_message>
Add validation system, multi-format output, and shareable folder
- Three-layer validation: per-round interview checks with reflect-back
  confirmations, pre-calculation data completeness, post-calculation
  math and cross-file consistency checks
- Multi-format output: shareable/ folder with PDFs + Excel budget
- README.txt in output folder explaining all files
- Updated README.md, Getting Started Guide, and .skill file

Co-Authored-By: Claude Opus 4.6 (1M context) <noreply@anthropic.com>
</commit_message>
<xml_diff>
--- a/Getting-Started-Guide.docx
+++ b/Getting-Started-Guide.docx
@@ -2521,8 +2521,9 @@
       </w:r>
     </w:p>
     <w:p>
-      <w:r>
-        <w:t xml:space="preserve">After the interview, Claude builds your complete financial plan and saves four files to the folder you selected:</w:t>
+      <w:r/>
+      <w:r>
+        <w:t>After the interview, Claude builds your complete financial plan and saves files to the folder you selected:</w:t>
       </w:r>
     </w:p>
     <w:p>
@@ -2845,13 +2846,18 @@
       </w:r>
     </w:p>
     <w:p>
+      <w:r/>
+      <w:r>
+        <w:t xml:space="preserve">The .md files are plain text (Markdown) — your working files that let Claude resume where you left off. The .html dashboard opens in Chrome, Safari, Firefox, or Edge. Claude also creates a </w:t>
+      </w:r>
       <w:r>
         <w:rPr>
-          <w:i/>
-          <w:iCs/>
-          <w:color w:val="6B7280"/>
+          <w:b/>
         </w:rPr>
-        <w:t xml:space="preserve">The .md files are plain text (Markdown) and can be opened in any text editor, VS Code, or Markdown viewer. The .html dashboard opens in Chrome, Safari, Firefox, or Edge.</w:t>
+        <w:t>shareable/</w:t>
+      </w:r>
+      <w:r>
+        <w:t xml:space="preserve"> folder with polished PDF versions of your profile, budget, and plan — plus an editable Excel budget spreadsheet. These are ready to email to a spouse, accountant, or financial advisor. A README.txt file explains what each file is for.</w:t>
       </w:r>
     </w:p>
     <w:p>

</xml_diff>

<commit_message>
Add version number to SKILL.md and update instructions to Getting Started Guide
- Version 1.2 shown at top of SKILL.md with link to releases page
- New "Checking for Updates" section in Getting Started Guide explaining
  how to check for and install updates

Co-Authored-By: Claude Opus 4.6 (1M context) <noreply@anthropic.com>
</commit_message>
<xml_diff>
--- a/Getting-Started-Guide.docx
+++ b/Getting-Started-Guide.docx
@@ -5023,6 +5023,44 @@
         <w:t xml:space="preserve"> and the skill will activate. Your plan files will be saved in your Windows Documents &gt; MyFinances folder, accessible from File Explorer as normal.</w:t>
       </w:r>
     </w:p>
+    <w:p>
+      <w:pPr>
+        <w:pStyle w:val="Heading 1"/>
+      </w:pPr>
+      <w:r>
+        <w:t xml:space="preserve">Checking for Updates</w:t>
+      </w:r>
+    </w:p>
+    <w:p/>
+    <w:p>
+      <w:r>
+        <w:t xml:space="preserve">This skill does not update automatically. When a new version is released, you'll need to download the updated .skill file and re-upload it to Claude.</w:t>
+      </w:r>
+    </w:p>
+    <w:p/>
+    <w:p>
+      <w:r>
+        <w:t xml:space="preserve">To check for updates, visit the releases page on GitHub:</w:t>
+      </w:r>
+    </w:p>
+    <w:p>
+      <w:r>
+        <w:t xml:space="preserve">https://github.com/cjpatten/canadian-finance-planner-skill/releases</w:t>
+      </w:r>
+    </w:p>
+    <w:p/>
+    <w:p>
+      <w:r>
+        <w:t xml:space="preserve">To update: download the latest financial-planner.skill file from the releases page, then go to Customize &gt; Skills in the Claude desktop app and upload the new file. It will replace the old version. Your existing plan files (profile, budget, plan, dashboard) are not affected — they stay in your folder.</w:t>
+      </w:r>
+    </w:p>
+    <w:p/>
+    <w:p>
+      <w:r>
+        <w:t xml:space="preserve">You can check which version you're running by looking at the top of SKILL.md — it shows the version number and last updated date.</w:t>
+      </w:r>
+    </w:p>
+    <w:p/>
     <w:p>
       <w:pPr>
         <w:pStyle w:val="Heading1"/>

</xml_diff>

<commit_message>
Fix marketplace name to kebab-case (Issue #8) + rewrite Getting Started Guide for v2.0
Marketplace fix:
- Changed name from "Canadian Personal Finance Manager" (spaces) to
  "canadian-finance-planner" (kebab-case) per marketplace schema
- Updated owner to use GitHub username

Getting Started Guide rewrite:
- Version 1.0 → 2.0
- Feature list expanded from 5 to 15 items covering all new capabilities
- Interview section updated with validation note
- Added 6 new Ongoing Use subsections: Debt Help, Housing Decisions,
  Insurance Review, Tax Filing Help, Investment Questions, Self-Employment

Co-Authored-By: Claude Opus 4.6 (1M context) <noreply@anthropic.com>
</commit_message>
<xml_diff>
--- a/Getting-Started-Guide.docx
+++ b/Getting-Started-Guide.docx
@@ -198,7 +198,7 @@
           <w:sz w:val="20"/>
           <w:szCs w:val="20"/>
         </w:rPr>
-        <w:t xml:space="preserve">Version 1.0  |  March 2026</w:t>
+        <w:t>Version 2.0  |  March 2026</w:t>
       </w:r>
     </w:p>
     <w:p>
@@ -249,8 +249,9 @@
           <w:numId w:val="2"/>
         </w:numPr>
       </w:pPr>
-      <w:r>
-        <w:t xml:space="preserve">A personalized financial profile saved to your computer</w:t>
+      <w:r/>
+      <w:r>
+        <w:t>A personalized financial profile saved to your computer</w:t>
       </w:r>
     </w:p>
     <w:p>
@@ -261,8 +262,9 @@
           <w:numId w:val="2"/>
         </w:numPr>
       </w:pPr>
-      <w:r>
-        <w:t xml:space="preserve">A detailed monthly budget with spending insights</w:t>
+      <w:r/>
+      <w:r>
+        <w:t>A detailed monthly budget with spending insights and optimization suggestions</w:t>
       </w:r>
     </w:p>
     <w:p>
@@ -273,8 +275,9 @@
           <w:numId w:val="2"/>
         </w:numPr>
       </w:pPr>
-      <w:r>
-        <w:t xml:space="preserve">A phased action plan (stabilize, build, accelerate)</w:t>
+      <w:r/>
+      <w:r>
+        <w:t>A phased action plan (Stabilize → Build → Accelerate) with timelines</w:t>
       </w:r>
     </w:p>
     <w:p>
@@ -285,8 +288,9 @@
           <w:numId w:val="2"/>
         </w:numPr>
       </w:pPr>
-      <w:r>
-        <w:t xml:space="preserve">An interactive HTML dashboard with charts and projections</w:t>
+      <w:r/>
+      <w:r>
+        <w:t>An interactive HTML dashboard with 16+ charts and projections</w:t>
       </w:r>
     </w:p>
     <w:p>
@@ -297,8 +301,129 @@
           <w:numId w:val="2"/>
         </w:numPr>
       </w:pPr>
-      <w:r>
-        <w:t xml:space="preserve">Ongoing coaching: monthly check-ins, purchase decisions, life change updates</w:t>
+      <w:r/>
+      <w:r>
+        <w:t>Shareable PDFs and an editable Excel budget — ready to email to a spouse, advisor, or accountant</w:t>
+      </w:r>
+    </w:p>
+    <w:p>
+      <w:pPr>
+        <w:pStyle w:val="ListParagraph"/>
+        <w:numPr>
+          <w:ilvl w:val="0"/>
+          <w:numId w:val="2"/>
+        </w:numPr>
+      </w:pPr>
+      <w:r>
+        <w:t xml:space="preserve">Investment education with ETF comparisons, GIC rates, and growth projections</w:t>
+      </w:r>
+    </w:p>
+    <w:p>
+      <w:pPr>
+        <w:pStyle w:val="ListParagraph"/>
+        <w:numPr>
+          <w:ilvl w:val="0"/>
+          <w:numId w:val="2"/>
+        </w:numPr>
+      </w:pPr>
+      <w:r>
+        <w:t xml:space="preserve">Life event action plans — new baby, marriage, divorce, job loss, parental leave, and 5 more</w:t>
+      </w:r>
+    </w:p>
+    <w:p>
+      <w:pPr>
+        <w:pStyle w:val="ListParagraph"/>
+        <w:numPr>
+          <w:ilvl w:val="0"/>
+          <w:numId w:val="2"/>
+        </w:numPr>
+      </w:pPr>
+      <w:r>
+        <w:t xml:space="preserve">Debt strategy guidance — consumer proposals, credit rebuilding, collections rights, CRA tax debt</w:t>
+      </w:r>
+    </w:p>
+    <w:p>
+      <w:pPr>
+        <w:pStyle w:val="ListParagraph"/>
+        <w:numPr>
+          <w:ilvl w:val="0"/>
+          <w:numId w:val="2"/>
+        </w:numPr>
+      </w:pPr>
+      <w:r>
+        <w:t xml:space="preserve">Real estate analysis — rent vs buy, mortgage strategy, home equity, investment property</w:t>
+      </w:r>
+    </w:p>
+    <w:p>
+      <w:pPr>
+        <w:pStyle w:val="ListParagraph"/>
+        <w:numPr>
+          <w:ilvl w:val="0"/>
+          <w:numId w:val="2"/>
+        </w:numPr>
+      </w:pPr>
+      <w:r>
+        <w:t xml:space="preserve">Insurance guidance — life, disability, critical illness with cost estimates and decision frameworks</w:t>
+      </w:r>
+    </w:p>
+    <w:p>
+      <w:pPr>
+        <w:pStyle w:val="ListParagraph"/>
+        <w:numPr>
+          <w:ilvl w:val="0"/>
+          <w:numId w:val="2"/>
+        </w:numPr>
+      </w:pPr>
+      <w:r>
+        <w:t xml:space="preserve">Province-specific rules for all 13 provinces and territories (full Quebec QPP/QST/QPIP support)</w:t>
+      </w:r>
+    </w:p>
+    <w:p>
+      <w:pPr>
+        <w:pStyle w:val="ListParagraph"/>
+        <w:numPr>
+          <w:ilvl w:val="0"/>
+          <w:numId w:val="2"/>
+        </w:numPr>
+      </w:pPr>
+      <w:r>
+        <w:t xml:space="preserve">Self-employed and incorporated business planning — incorporation, salary vs dividends, SRED, IPP</w:t>
+      </w:r>
+    </w:p>
+    <w:p>
+      <w:pPr>
+        <w:pStyle w:val="ListParagraph"/>
+        <w:numPr>
+          <w:ilvl w:val="0"/>
+          <w:numId w:val="2"/>
+        </w:numPr>
+      </w:pPr>
+      <w:r>
+        <w:t xml:space="preserve">Portfolio management — rebalancing, tax-loss harvesting, asset location, retirement withdrawal strategy</w:t>
+      </w:r>
+    </w:p>
+    <w:p>
+      <w:pPr>
+        <w:pStyle w:val="ListParagraph"/>
+        <w:numPr>
+          <w:ilvl w:val="0"/>
+          <w:numId w:val="2"/>
+        </w:numPr>
+      </w:pPr>
+      <w:r>
+        <w:t xml:space="preserve">Tax filing season guide — credits, deductions, couples optimization, CRA disputes</w:t>
+      </w:r>
+    </w:p>
+    <w:p>
+      <w:pPr>
+        <w:pStyle w:val="ListParagraph"/>
+        <w:numPr>
+          <w:ilvl w:val="0"/>
+          <w:numId w:val="2"/>
+        </w:numPr>
+      </w:pPr>
+      <w:r>
+        <w:t xml:space="preserve">Ongoing coaching — monthly check-ins, purchase decisions, life changes, and quick questions</w:t>
       </w:r>
     </w:p>
     <w:p>
@@ -1583,8 +1708,9 @@
       </w:r>
     </w:p>
     <w:p>
-      <w:r>
-        <w:t xml:space="preserve">Once the skill is installed, just start a new Cowork conversation and say something like:</w:t>
+      <w:r/>
+      <w:r>
+        <w:t>Claude will then walk you through a financial interview in 7 rounds. It asks 2–3 questions at a time (never a wall of questions), explains why each one matters, and confirms what it heard after each round to make sure nothing was missed. The interview covers: your life situation, income, expenses, debts, assets &amp; savings, insurance, and goals.</w:t>
       </w:r>
     </w:p>
     <w:p>
@@ -3204,6 +3330,121 @@
         </w:tc>
       </w:tr>
     </w:tbl>
+    <w:p/>
+    <w:p>
+      <w:pPr>
+        <w:pStyle w:val="Heading 2"/>
+      </w:pPr>
+      <w:r>
+        <w:t xml:space="preserve">Debt Help</w:t>
+      </w:r>
+    </w:p>
+    <w:p>
+      <w:r>
+        <w:t xml:space="preserve">Say: "I can't make my payments" or "Should I do a consumer proposal?" or "I have payday loan debt"</w:t>
+      </w:r>
+    </w:p>
+    <w:p>
+      <w:r>
+        <w:t xml:space="preserve">Claude provides structured guidance on debt consolidation, consumer proposals, bankruptcy options, collections rights, CRA tax debt strategies, and credit score rebuilding — all specific to Canadian law and programs.</w:t>
+      </w:r>
+    </w:p>
+    <w:p/>
+    <w:p>
+      <w:pPr>
+        <w:pStyle w:val="Heading 2"/>
+      </w:pPr>
+      <w:r>
+        <w:t xml:space="preserve">Housing Decisions</w:t>
+      </w:r>
+    </w:p>
+    <w:p>
+      <w:r>
+        <w:t xml:space="preserve">Say: "Should I rent or buy?" or "My mortgage is up for renewal" or "Should I get a HELOC?"</w:t>
+      </w:r>
+    </w:p>
+    <w:p>
+      <w:r>
+        <w:t xml:space="preserve">Claude runs a rent vs buy analysis using your actual numbers, helps with mortgage renewal negotiation, explains home equity options, and can analyze investment property opportunities — including provincial land transfer tax and the principal residence exemption.</w:t>
+      </w:r>
+    </w:p>
+    <w:p/>
+    <w:p>
+      <w:pPr>
+        <w:pStyle w:val="Heading 2"/>
+      </w:pPr>
+      <w:r>
+        <w:t xml:space="preserve">Insurance Review</w:t>
+      </w:r>
+    </w:p>
+    <w:p>
+      <w:r>
+        <w:t xml:space="preserve">Say: "Do I have enough life insurance?" or "What disability insurance do I need?"</w:t>
+      </w:r>
+    </w:p>
+    <w:p>
+      <w:r>
+        <w:t xml:space="preserve">Claude calculates your insurance needs using the DIME method (Debt, Income replacement, Mortgage, Education), compares term vs permanent life insurance with cost estimates by age, and explains disability and critical illness coverage options.</w:t>
+      </w:r>
+    </w:p>
+    <w:p/>
+    <w:p>
+      <w:pPr>
+        <w:pStyle w:val="Heading 2"/>
+      </w:pPr>
+      <w:r>
+        <w:t xml:space="preserve">Tax Filing Help</w:t>
+      </w:r>
+    </w:p>
+    <w:p>
+      <w:r>
+        <w:t xml:space="preserve">Say: "Help me with my taxes" or "What deductions am I missing?" or "Who should claim the medical expenses?"</w:t>
+      </w:r>
+    </w:p>
+    <w:p>
+      <w:r>
+        <w:t xml:space="preserve">Claude provides a complete checklist of credits and deductions, optimizes claims between spouses, helps with investment income reporting, and explains CRA My Account, penalties, and dispute processes.</w:t>
+      </w:r>
+    </w:p>
+    <w:p/>
+    <w:p>
+      <w:pPr>
+        <w:pStyle w:val="Heading 2"/>
+      </w:pPr>
+      <w:r>
+        <w:t xml:space="preserve">Investment Questions</w:t>
+      </w:r>
+    </w:p>
+    <w:p>
+      <w:r>
+        <w:t xml:space="preserve">Say: "How should I invest?" or "Should I rebalance my portfolio?" or "What about tax-loss harvesting?"</w:t>
+      </w:r>
+    </w:p>
+    <w:p>
+      <w:r>
+        <w:t xml:space="preserve">Claude covers everything from beginner-friendly all-in-one ETFs to advanced strategies like asset location optimization, the superficial loss rule, US withholding tax, employee stock options, and retirement withdrawal sequencing.</w:t>
+      </w:r>
+    </w:p>
+    <w:p/>
+    <w:p>
+      <w:pPr>
+        <w:pStyle w:val="Heading 2"/>
+      </w:pPr>
+      <w:r>
+        <w:t xml:space="preserve">Self-Employment</w:t>
+      </w:r>
+    </w:p>
+    <w:p>
+      <w:r>
+        <w:t xml:space="preserve">Say: "Should I incorporate?" or "What can I deduct?" or "Salary vs dividends?"</w:t>
+      </w:r>
+    </w:p>
+    <w:p>
+      <w:r>
+        <w:t xml:space="preserve">Claude walks through the incorporation decision with actual tax math, optimizes salary vs dividend mix, explains business deductions (home office, vehicle, CCA), HST/GST registration, SRED tax credits, and business succession planning with the $1.25M lifetime capital gains exemption.</w:t>
+      </w:r>
+    </w:p>
+    <w:p/>
     <w:p>
       <w:pPr>
         <w:pStyle w:val="Heading1"/>

</xml_diff>

<commit_message>
Add 45 example prompts showcasing skill capabilities
New "What Can I Ask?" section added to both README.md and Getting
Started Guide with 45 example prompts organized by category:
Getting Started, Budgeting, Debt, Investing, Retirement, Real Estate,
Insurance, Taxes, Life Events, Self-Employment, and Estate Planning.

Prompts progress from simple to complex within each category to
show the breadth without being intimidating. Each prompt verified
against actual skill reference files to ensure it can be answered.

Co-Authored-By: Claude Opus 4.6 (1M context) <noreply@anthropic.com>
</commit_message>
<xml_diff>
--- a/Getting-Started-Guide.docx
+++ b/Getting-Started-Guide.docx
@@ -3430,6 +3430,196 @@
     <w:p>
       <w:r>
         <w:t xml:space="preserve">Claude walks through the incorporation decision with actual tax math, optimizes salary vs dividend mix, explains business deductions (home office, vehicle, CCA), HST/GST registration, SRED tax credits, and business succession planning with the $1.25M lifetime capital gains exemption.</w:t>
+      </w:r>
+    </w:p>
+    <w:p/>
+    <w:p>
+      <w:pPr>
+        <w:pStyle w:val="Heading 1"/>
+      </w:pPr>
+      <w:r>
+        <w:t xml:space="preserve">What Can I Ask? (Example Prompts)</w:t>
+      </w:r>
+    </w:p>
+    <w:p>
+      <w:r>
+        <w:t xml:space="preserve">This skill covers far more than basic budgeting. Here are examples of what you can ask Claude, from simple to advanced. Just type any of these in a Cowork conversation:</w:t>
+      </w:r>
+    </w:p>
+    <w:p/>
+    <w:p>
+      <w:pPr>
+        <w:pStyle w:val="Heading 2"/>
+      </w:pPr>
+      <w:r>
+        <w:t xml:space="preserve">Getting Started &amp; Budgeting</w:t>
+      </w:r>
+    </w:p>
+    <w:p>
+      <w:r>
+        <w:rPr>
+          <w:i/>
+        </w:rPr>
+        <w:t xml:space="preserve">"Help me with my finances" • "Where is all my money going?" • "Should I buy a $900 TV?"</w:t>
+      </w:r>
+    </w:p>
+    <w:p/>
+    <w:p>
+      <w:pPr>
+        <w:pStyle w:val="Heading 2"/>
+      </w:pPr>
+      <w:r>
+        <w:t xml:space="preserve">Debt</w:t>
+      </w:r>
+    </w:p>
+    <w:p>
+      <w:r>
+        <w:rPr>
+          <w:i/>
+        </w:rPr>
+        <w:t xml:space="preserve">"How do I pay off my credit card fastest?" • "Should I consolidate?" • "What are my rights if a collector calls?" • "Should I do a consumer proposal?"</w:t>
+      </w:r>
+    </w:p>
+    <w:p/>
+    <w:p>
+      <w:pPr>
+        <w:pStyle w:val="Heading 2"/>
+      </w:pPr>
+      <w:r>
+        <w:t xml:space="preserve">Investing</w:t>
+      </w:r>
+    </w:p>
+    <w:p>
+      <w:r>
+        <w:rPr>
+          <w:i/>
+        </w:rPr>
+        <w:t xml:space="preserve">"How do I start investing?" • "TFSA or RRSP first?" • "What’s a good all-in-one ETF?" • "How should I split $200K across my accounts?"</w:t>
+      </w:r>
+    </w:p>
+    <w:p/>
+    <w:p>
+      <w:pPr>
+        <w:pStyle w:val="Heading 2"/>
+      </w:pPr>
+      <w:r>
+        <w:t xml:space="preserve">Retirement</w:t>
+      </w:r>
+    </w:p>
+    <w:p>
+      <w:r>
+        <w:rPr>
+          <w:i/>
+        </w:rPr>
+        <w:t xml:space="preserve">"When can I retire?" • "Should I take CPP at 60 or 70?" • "How do I avoid OAS clawback?" • "Should I take the pension lump sum or monthly?"</w:t>
+      </w:r>
+    </w:p>
+    <w:p/>
+    <w:p>
+      <w:pPr>
+        <w:pStyle w:val="Heading 2"/>
+      </w:pPr>
+      <w:r>
+        <w:t xml:space="preserve">Real Estate</w:t>
+      </w:r>
+    </w:p>
+    <w:p>
+      <w:r>
+        <w:rPr>
+          <w:i/>
+        </w:rPr>
+        <w:t xml:space="preserve">"Should I rent or buy?" • "How do I negotiate my mortgage renewal?" • "Should I pay down the mortgage or invest?" • "What’s the tax on a rental property?"</w:t>
+      </w:r>
+    </w:p>
+    <w:p/>
+    <w:p>
+      <w:pPr>
+        <w:pStyle w:val="Heading 2"/>
+      </w:pPr>
+      <w:r>
+        <w:t xml:space="preserve">Insurance</w:t>
+      </w:r>
+    </w:p>
+    <w:p>
+      <w:r>
+        <w:rPr>
+          <w:i/>
+        </w:rPr>
+        <w:t xml:space="preserve">"How much life insurance do I need?" • "Do I need disability insurance?" • "My bank is pushing whole life — is that smart?"</w:t>
+      </w:r>
+    </w:p>
+    <w:p/>
+    <w:p>
+      <w:pPr>
+        <w:pStyle w:val="Heading 2"/>
+      </w:pPr>
+      <w:r>
+        <w:t xml:space="preserve">Taxes</w:t>
+      </w:r>
+    </w:p>
+    <w:p>
+      <w:r>
+        <w:rPr>
+          <w:i/>
+        </w:rPr>
+        <w:t xml:space="preserve">"What deductions am I missing?" • "Who should claim the medical expenses, me or my spouse?" • "I’m self-employed — what can I deduct?"</w:t>
+      </w:r>
+    </w:p>
+    <w:p/>
+    <w:p>
+      <w:pPr>
+        <w:pStyle w:val="Heading 2"/>
+      </w:pPr>
+      <w:r>
+        <w:t xml:space="preserve">Life Events</w:t>
+      </w:r>
+    </w:p>
+    <w:p>
+      <w:r>
+        <w:rPr>
+          <w:i/>
+        </w:rPr>
+        <w:t xml:space="preserve">"We’re having a baby!" • "I lost my job" • "We’re getting divorced" • "I inherited $150K" • "I’m caring for my aging parents"</w:t>
+      </w:r>
+    </w:p>
+    <w:p/>
+    <w:p>
+      <w:pPr>
+        <w:pStyle w:val="Heading 2"/>
+      </w:pPr>
+      <w:r>
+        <w:t xml:space="preserve">Self-Employment</w:t>
+      </w:r>
+    </w:p>
+    <w:p>
+      <w:r>
+        <w:rPr>
+          <w:i/>
+        </w:rPr>
+        <w:t xml:space="preserve">"Should I incorporate?" • "Salary vs dividends?" • "What’s the lifetime capital gains exemption?"</w:t>
+      </w:r>
+    </w:p>
+    <w:p/>
+    <w:p>
+      <w:pPr>
+        <w:pStyle w:val="Heading 2"/>
+      </w:pPr>
+      <w:r>
+        <w:t xml:space="preserve">Estate Planning</w:t>
+      </w:r>
+    </w:p>
+    <w:p>
+      <w:r>
+        <w:rPr>
+          <w:i/>
+        </w:rPr>
+        <w:t xml:space="preserve">"I don’t have a will — what happens?" • "How do I pass my cottage to my kids?" • "What’s a Henson trust?" • "I’ve been named executor — what do I do?"</w:t>
+      </w:r>
+    </w:p>
+    <w:p/>
+    <w:p>
+      <w:r>
+        <w:t xml:space="preserve">These are just examples — Claude adapts to your specific situation using your actual financial data. The more you share, the more personalized and accurate the guidance becomes.</w:t>
       </w:r>
     </w:p>
     <w:p/>

</xml_diff>

<commit_message>
Fix pricing to actual Anthropic CAD prices from claude.com/pricing
Pro: C$24/mo (billed annually), Max: from C$140/mo,
Team: C$27.42/seat/mo (standard). Previous values were
estimated USD-to-CAD conversions — now using actual prices
from Anthropic's pricing page. Prices exclude tax.

Co-Authored-By: Claude Opus 4.6 (1M context) <noreply@anthropic.com>
</commit_message>
<xml_diff>
--- a/Getting-Started-Guide.docx
+++ b/Getting-Started-Guide.docx
@@ -685,7 +685,7 @@
           </w:tcPr>
           <w:p>
             <w:r>
-              <w:t>~$27 CAD/month</w:t>
+              <w:t>C$24/month (billed annually)</w:t>
             </w:r>
           </w:p>
         </w:tc>
@@ -764,7 +764,7 @@
           </w:tcPr>
           <w:p>
             <w:r>
-              <w:t>~$136–272 CAD/month</w:t>
+              <w:t>From C$140/month</w:t>
             </w:r>
           </w:p>
         </w:tc>
@@ -843,7 +843,7 @@
           </w:tcPr>
           <w:p>
             <w:r>
-              <w:t>~$41 CAD/person/month</w:t>
+              <w:t>C$27.42/seat/month (standard)</w:t>
             </w:r>
           </w:p>
         </w:tc>

</xml_diff>

<commit_message>
Add reassuring intro to Getting Started Guide feature list
Same warm intro as README — tells users they don't need to use
everything, most start simple, the skill meets them where they are.

Co-Authored-By: Claude Opus 4.6 (1M context) <noreply@anthropic.com>
</commit_message>
<xml_diff>
--- a/Getting-Started-Guide.docx
+++ b/Getting-Started-Guide.docx
@@ -233,12 +233,20 @@
       </w:r>
     </w:p>
     <w:p>
+      <w:r/>
       <w:r>
         <w:rPr>
           <w:b/>
-          <w:bCs/>
         </w:rPr>
-        <w:t xml:space="preserve">What you get:</w:t>
+        <w:t>What you get:</w:t>
+      </w:r>
+    </w:p>
+    <w:p>
+      <w:r>
+        <w:rPr>
+          <w:i/>
+        </w:rPr>
+        <w:t xml:space="preserve">You don’t need to use all of this — most people start with a simple budget and go from there. Claude meets you where you are. The list below shows everything the skill can do, not what you have to do. Think of it as having a top-tier financial advisor on call.</w:t>
       </w:r>
     </w:p>
     <w:p>

</xml_diff>

<commit_message>
Rebrand as AI Financial Coach across all user-facing documents
- README: Added subtitle "Your AI Financial Coach — Built for
  Canadians", updated tagline and reassuring intro
- SKILL.md: "You are a Personal Finance Manager" → "You are an
  AI Financial Coach"
- Getting Started Guide: Subtitle "A Custom Skill for Claude" →
  "Your AI Financial Coach", updated description and reassuring intro

Consistent branding across all touchpoints. "Coach" is warmer and
more approachable than "Manager" — a coach helps you, works alongside
you, doesn't judge.

Co-Authored-By: Claude Opus 4.6 (1M context) <noreply@anthropic.com>
</commit_message>
<xml_diff>
--- a/Getting-Started-Guide.docx
+++ b/Getting-Started-Guide.docx
@@ -64,14 +64,9 @@
         <w:spacing w:after="100"/>
         <w:jc w:val="center"/>
       </w:pPr>
-      <w:r>
-        <w:rPr>
-          <w:rFonts w:ascii="Arial" w:cs="Arial" w:eastAsia="Arial" w:hAnsi="Arial"/>
-          <w:color w:val="6B7280"/>
-          <w:sz w:val="36"/>
-          <w:szCs w:val="36"/>
-        </w:rPr>
-        <w:t xml:space="preserve">A Custom Skill for Claude</w:t>
+      <w:r/>
+      <w:r>
+        <w:t>Your AI Financial Coach</w:t>
       </w:r>
     </w:p>
     <w:p>
@@ -220,8 +215,9 @@
       </w:r>
     </w:p>
     <w:p>
-      <w:r>
-        <w:t xml:space="preserve">The Canadian Personal Finance Manager is a custom skill that turns Claude into your personal financial planner. Once installed, Claude will conduct a thorough financial interview, build a complete budget and action plan, generate an interactive dashboard, and provide ongoing coaching — all tailored specifically for Canadians with Canadian tax rules, government benefits, and registered accounts (RRSPs, TFSAs, RESPs, FHSA, and more).</w:t>
+      <w:r/>
+      <w:r>
+        <w:t>The Canadian Personal Finance Manager is a custom skill that turns Claude into your personal AI financial coach. Once installed, Claude conducts a thorough financial interview, builds a complete plan with budget and projections, generates an interactive dashboard, and provides ongoing coaching — all tailored to Canadian tax rules, government benefits, and registered accounts.</w:t>
       </w:r>
     </w:p>
     <w:p>
@@ -246,7 +242,7 @@
         <w:rPr>
           <w:i/>
         </w:rPr>
-        <w:t>You don’t need to use all of the below features — most people start with a simple budget and go from there. Claude meets you where you are. The list below shows everything the skill can do, not what you have to do. Think of it as having a top-tier financial advisor on call.</w:t>
+        <w:t>You don’t need to use all of the below features — most people start with a simple budget and go from there. Claude meets you where you are. The list below shows everything the skill can do, not what you have to do. Think of it as having a AI financial coach on call.</w:t>
       </w:r>
     </w:p>
     <w:p>

</xml_diff>

<commit_message>
Move SKILL.md and references/ to repo root for Claude Desktop compatibility
GitHub's "Download ZIP" nests files under repo-name-main/, which put
SKILL.md two levels deep. Claude Desktop requires SKILL.md at the ZIP
root. Moving skill files to the repo root fixes this so any download
method works — source ZIP, .skill release, or git clone.

Co-Authored-By: Claude Opus 4.6 (1M context) <noreply@anthropic.com>
</commit_message>
<xml_diff>
--- a/Getting-Started-Guide.docx
+++ b/Getting-Started-Guide.docx
@@ -4286,11 +4286,11 @@
                 <w:sz w:val="20"/>
                 <w:szCs w:val="20"/>
               </w:rPr>
-              <w:t xml:space="preserve"># Install from GitHub
-mkdir -p ~/.claude/skills
-git clone https://github.com/cjpatten/canadian-finance-planner-skill.git
-cp -r canadian-finance-planner-skill/financial-planner ~/.claude/skills/
-rm -rf canadian-finance-planner-skill</w:t>
+              <w:t># Install from GitHub</w:t>
+              <w:br/>
+              <w:t>mkdir -p ~/.claude/skills</w:t>
+              <w:br/>
+              <w:t>git clone https://github.com/cjpatten/canadian-finance-planner-skill.git ~/.claude/skills/financial-planner</w:t>
             </w:r>
           </w:p>
           <w:p>
@@ -4301,11 +4301,11 @@
                 <w:sz w:val="22"/>
                 <w:szCs w:val="22"/>
               </w:rPr>
-              <w:t xml:space="preserve"># Install from GitHub
-mkdir -p ~/.claude/skills
-git clone https://github.com/cjpatten/canadian-finance-planner-skill.git
-cp -r canadian-finance-planner-skill/financial-planner ~/.claude/skills/
-rm -rf canadian-finance-planner-skill</w:t>
+              <w:t># Install from GitHub</w:t>
+              <w:br/>
+              <w:t>mkdir -p ~/.claude/skills</w:t>
+              <w:br/>
+              <w:t>git clone https://github.com/cjpatten/canadian-finance-planner-skill.git ~/.claude/skills/financial-planner</w:t>
             </w:r>
           </w:p>
           <w:p>
@@ -4316,11 +4316,11 @@
                 <w:sz w:val="22"/>
                 <w:szCs w:val="22"/>
               </w:rPr>
-              <w:t xml:space="preserve"># Install from GitHub
-mkdir -p ~/.claude/skills
-git clone https://github.com/cjpatten/canadian-finance-planner-skill.git
-cp -r canadian-finance-planner-skill/financial-planner ~/.claude/skills/
-rm -rf canadian-finance-planner-skill</w:t>
+              <w:t># Install from GitHub</w:t>
+              <w:br/>
+              <w:t>mkdir -p ~/.claude/skills</w:t>
+              <w:br/>
+              <w:t>git clone https://github.com/cjpatten/canadian-finance-planner-skill.git ~/.claude/skills/financial-planner</w:t>
             </w:r>
           </w:p>
           <w:p>
@@ -4331,11 +4331,11 @@
                 <w:sz w:val="20"/>
                 <w:szCs w:val="20"/>
               </w:rPr>
-              <w:t xml:space="preserve"># Install from GitHub
-mkdir -p ~/.claude/skills
-git clone https://github.com/cjpatten/canadian-finance-planner-skill.git
-cp -r canadian-finance-planner-skill/financial-planner ~/.claude/skills/
-rm -rf canadian-finance-planner-skill</w:t>
+              <w:t># Install from GitHub</w:t>
+              <w:br/>
+              <w:t>mkdir -p ~/.claude/skills</w:t>
+              <w:br/>
+              <w:t>git clone https://github.com/cjpatten/canadian-finance-planner-skill.git ~/.claude/skills/financial-planner</w:t>
             </w:r>
           </w:p>
           <w:p>
@@ -4346,11 +4346,11 @@
                 <w:sz w:val="22"/>
                 <w:szCs w:val="22"/>
               </w:rPr>
-              <w:t xml:space="preserve"># Install from GitHub
-mkdir -p ~/.claude/skills
-git clone https://github.com/cjpatten/canadian-finance-planner-skill.git
-cp -r canadian-finance-planner-skill/financial-planner ~/.claude/skills/
-rm -rf canadian-finance-planner-skill</w:t>
+              <w:t># Install from GitHub</w:t>
+              <w:br/>
+              <w:t>mkdir -p ~/.claude/skills</w:t>
+              <w:br/>
+              <w:t>git clone https://github.com/cjpatten/canadian-finance-planner-skill.git ~/.claude/skills/financial-planner</w:t>
             </w:r>
           </w:p>
         </w:tc>
@@ -5220,11 +5220,11 @@
                 <w:sz w:val="20"/>
                 <w:szCs w:val="20"/>
               </w:rPr>
-              <w:t xml:space="preserve"># Install from GitHub
-mkdir -p ~/.claude/skills
-git clone https://github.com/cjpatten/canadian-finance-planner-skill.git
-cp -r canadian-finance-planner-skill/financial-planner ~/.claude/skills/
-rm -rf canadian-finance-planner-skill</w:t>
+              <w:t># Install from GitHub</w:t>
+              <w:br/>
+              <w:t>mkdir -p ~/.claude/skills</w:t>
+              <w:br/>
+              <w:t>git clone https://github.com/cjpatten/canadian-finance-planner-skill.git ~/.claude/skills/financial-planner</w:t>
             </w:r>
           </w:p>
           <w:p>
@@ -5235,11 +5235,11 @@
                 <w:sz w:val="22"/>
                 <w:szCs w:val="22"/>
               </w:rPr>
-              <w:t xml:space="preserve"># Install from GitHub
-mkdir -p ~/.claude/skills
-git clone https://github.com/cjpatten/canadian-finance-planner-skill.git
-cp -r canadian-finance-planner-skill/financial-planner ~/.claude/skills/
-rm -rf canadian-finance-planner-skill</w:t>
+              <w:t># Install from GitHub</w:t>
+              <w:br/>
+              <w:t>mkdir -p ~/.claude/skills</w:t>
+              <w:br/>
+              <w:t>git clone https://github.com/cjpatten/canadian-finance-planner-skill.git ~/.claude/skills/financial-planner</w:t>
             </w:r>
           </w:p>
           <w:p>
@@ -5250,11 +5250,11 @@
                 <w:sz w:val="22"/>
                 <w:szCs w:val="22"/>
               </w:rPr>
-              <w:t xml:space="preserve"># Install from GitHub
-mkdir -p ~/.claude/skills
-git clone https://github.com/cjpatten/canadian-finance-planner-skill.git
-cp -r canadian-finance-planner-skill/financial-planner ~/.claude/skills/
-rm -rf canadian-finance-planner-skill</w:t>
+              <w:t># Install from GitHub</w:t>
+              <w:br/>
+              <w:t>mkdir -p ~/.claude/skills</w:t>
+              <w:br/>
+              <w:t>git clone https://github.com/cjpatten/canadian-finance-planner-skill.git ~/.claude/skills/financial-planner</w:t>
             </w:r>
           </w:p>
           <w:p>
@@ -5265,11 +5265,11 @@
                 <w:sz w:val="20"/>
                 <w:szCs w:val="20"/>
               </w:rPr>
-              <w:t xml:space="preserve"># Install from GitHub
-mkdir -p ~/.claude/skills
-git clone https://github.com/cjpatten/canadian-finance-planner-skill.git
-cp -r canadian-finance-planner-skill/financial-planner ~/.claude/skills/
-rm -rf canadian-finance-planner-skill</w:t>
+              <w:t># Install from GitHub</w:t>
+              <w:br/>
+              <w:t>mkdir -p ~/.claude/skills</w:t>
+              <w:br/>
+              <w:t>git clone https://github.com/cjpatten/canadian-finance-planner-skill.git ~/.claude/skills/financial-planner</w:t>
             </w:r>
           </w:p>
           <w:p>
@@ -5280,11 +5280,11 @@
                 <w:sz w:val="22"/>
                 <w:szCs w:val="22"/>
               </w:rPr>
-              <w:t xml:space="preserve"># Install from GitHub
-mkdir -p ~/.claude/skills
-git clone https://github.com/cjpatten/canadian-finance-planner-skill.git
-cp -r canadian-finance-planner-skill/financial-planner ~/.claude/skills/
-rm -rf canadian-finance-planner-skill</w:t>
+              <w:t># Install from GitHub</w:t>
+              <w:br/>
+              <w:t>mkdir -p ~/.claude/skills</w:t>
+              <w:br/>
+              <w:t>git clone https://github.com/cjpatten/canadian-finance-planner-skill.git ~/.claude/skills/financial-planner</w:t>
             </w:r>
           </w:p>
         </w:tc>

</xml_diff>

<commit_message>
Add cross-border, snowbird & newcomer planning (closes #6)
New references/cross-border.md covering:
- Tax residency determination (significant ties, NR73/NR74)
- Snowbird tax planning (substantial presence test, Form 8840, days counting)
- Canadians owning US real estate (FIRPTA, US estate tax, rental reporting)
- Newcomer onboarding (SIN, credit building, RRSP/TFSA room, T1135)
- Departure from Canada (deemed disposition, T1161, T1243, T2062)
- Foreign pension income (treaty treatment, US Social Security)
- FBAR & FATCA (US citizens in Canada, streamlined filing)
- Returning to Canada (re-establishing residency, health card, benefits)
- Foreign tax credits (T2209, T2036, avoiding double taxation)

Also: cross-references added to portfolio-management.md, tax-filing.md,
life-events.md. Version bumped to 2.4.

Closes #6

Co-Authored-By: Claude Opus 4.6 (1M context) <noreply@anthropic.com>
</commit_message>
<xml_diff>
--- a/Getting-Started-Guide.docx
+++ b/Getting-Started-Guide.docx
@@ -193,7 +193,7 @@
           <w:sz w:val="20"/>
           <w:szCs w:val="20"/>
         </w:rPr>
-        <w:t>Version 2.3  |  March 2026</w:t>
+        <w:t>Version 2.4  |  March 2026</w:t>
       </w:r>
     </w:p>
     <w:p>
@@ -344,6 +344,18 @@
       </w:pPr>
       <w:r>
         <w:t xml:space="preserve">Debt strategy guidance — consumer proposals, credit rebuilding, collections rights, CRA tax debt</w:t>
+      </w:r>
+    </w:p>
+    <w:p>
+      <w:pPr>
+        <w:pStyle w:val="ListParagraph"/>
+        <w:numPr>
+          <w:ilvl w:val="0"/>
+          <w:numId w:val="2"/>
+        </w:numPr>
+      </w:pPr>
+      <w:r>
+        <w:t xml:space="preserve">Cross-border planning — snowbird tax residency, newcomer financial onboarding, US property ownership (FIRPTA, estate tax), departure tax, foreign pensions, FBAR/FATCA, and returning to Canada</w:t>
       </w:r>
     </w:p>
     <w:p>

</xml_diff>

<commit_message>
Remove publisher-facing Publishing Tip from Getting Started Guide
The "Publishing Tip" callout was meant for the skill creator, not
the end user. Removed to keep the guide user-focused.

Co-Authored-By: Claude Opus 4.6 (1M context) <noreply@anthropic.com>
</commit_message>
<xml_diff>
--- a/Getting-Started-Guide.docx
+++ b/Getting-Started-Guide.docx
@@ -3278,62 +3278,6 @@
         <w:br w:type="page"/>
       </w:r>
     </w:p>
-    <w:tbl>
-      <w:tblPr>
-        <w:tblW w:type="dxa" w:w="9360"/>
-        <w:tblBorders>
-          <w:top w:val="single" w:color="auto" w:sz="4"/>
-          <w:left w:val="single" w:color="auto" w:sz="4"/>
-          <w:bottom w:val="single" w:color="auto" w:sz="4"/>
-          <w:right w:val="single" w:color="auto" w:sz="4"/>
-          <w:insideH w:val="single" w:color="auto" w:sz="4"/>
-          <w:insideV w:val="single" w:color="auto" w:sz="4"/>
-        </w:tblBorders>
-      </w:tblPr>
-      <w:tblGrid>
-        <w:gridCol w:w="9360"/>
-      </w:tblGrid>
-      <w:tr>
-        <w:tc>
-          <w:tcPr>
-            <w:tcW w:type="dxa" w:w="9360"/>
-            <w:tcBorders>
-              <w:top w:val="single" w:color="93C5FD" w:sz="1"/>
-              <w:left w:val="single" w:color="2563EB" w:sz="6"/>
-              <w:bottom w:val="single" w:color="93C5FD" w:sz="1"/>
-              <w:right w:val="single" w:color="93C5FD" w:sz="1"/>
-            </w:tcBorders>
-            <w:shd w:fill="EFF6FF" w:val="clear"/>
-            <w:tcMar>
-              <w:top w:type="dxa" w:w="120"/>
-              <w:left w:type="dxa" w:w="200"/>
-              <w:bottom w:type="dxa" w:w="120"/>
-              <w:right w:type="dxa" w:w="200"/>
-            </w:tcMar>
-          </w:tcPr>
-          <w:p>
-            <w:pPr>
-              <w:spacing w:after="60"/>
-            </w:pPr>
-            <w:r>
-              <w:rPr>
-                <w:b/>
-                <w:bCs/>
-                <w:color w:val="2563EB"/>
-                <w:sz w:val="22"/>
-                <w:szCs w:val="22"/>
-              </w:rPr>
-              <w:t xml:space="preserve">Publishing Tip</w:t>
-            </w:r>
-          </w:p>
-          <w:p>
-            <w:r>
-              <w:t xml:space="preserve">Include this getting-started guide alongside the .skill file when you share it. A skill is only useful if people know how to install and use it!</w:t>
-            </w:r>
-          </w:p>
-        </w:tc>
-      </w:tr>
-    </w:tbl>
     <w:p/>
     <w:p>
       <w:pPr>

</xml_diff>